<commit_message>
Feature the refreshed Football Week 4 plan.
Replace the download and move What’s New onto Sept 21–25.
</commit_message>
<xml_diff>
--- a/weekly-plans/PE-Weekly-Plan-Sept-21-25-2026-Football-Week-4.docx
+++ b/weekly-plans/PE-Weekly-Plan-Sept-21-25-2026-Football-Week-4.docx
@@ -3,12 +3,10 @@
 <w:document xmlns:wpc="http://schemas.microsoft.com/office/word/2010/wordprocessingCanvas" xmlns:mo="http://schemas.microsoft.com/office/mac/office/2008/main" xmlns:mc="http://schemas.openxmlformats.org/markup-compatibility/2006" xmlns:mv="urn:schemas-microsoft-com:mac:vml" xmlns:o="urn:schemas-microsoft-com:office:office" xmlns:r="http://schemas.openxmlformats.org/officeDocument/2006/relationships" xmlns:m="http://schemas.openxmlformats.org/officeDocument/2006/math" xmlns:v="urn:schemas-microsoft-com:vml" xmlns:wp14="http://schemas.microsoft.com/office/word/2010/wordprocessingDrawing" xmlns:wp="http://schemas.openxmlformats.org/drawingml/2006/wordprocessingDrawing" xmlns:w10="urn:schemas-microsoft-com:office:word" xmlns:w="http://schemas.openxmlformats.org/wordprocessingml/2006/main" xmlns:w14="http://schemas.microsoft.com/office/word/2010/wordml" xmlns:wpg="http://schemas.microsoft.com/office/word/2010/wordprocessingGroup" xmlns:wpi="http://schemas.microsoft.com/office/word/2010/wordprocessingInk" xmlns:wne="http://schemas.microsoft.com/office/word/2006/wordml" xmlns:wps="http://schemas.microsoft.com/office/word/2010/wordprocessingShape" mc:Ignorable="w14 wp14">
   <w:body>
     <w:p>
+      <w:pPr>
+        <w:pStyle w:val="Heading1"/>
+      </w:pPr>
       <w:r>
-        <w:rPr>
-          <w:rFonts w:ascii="Calibri" w:hAnsi="Calibri"/>
-          <w:b/>
-          <w:sz w:val="28"/>
-        </w:rPr>
         <w:t>PE Weekly Plan — Sept 21–25, 2026 · Football Week 4</w:t>
       </w:r>
     </w:p>
@@ -49,7 +47,7 @@
           <w:b w:val="0"/>
           <w:sz w:val="22"/>
         </w:rPr>
-        <w:t>Theme: Football intro Week 4 (school week) — SCA PE Playbook September lessons: hike, soft catch, overarm throw, move to the catch (playbook September Week 3 skill sequence).</w:t>
+        <w:t>Theme: Football intro Week 4 (school week) — SCA PE Playbook September Week 3 skill sequence: hike, soft catch, overarm throw, move to the catch.</w:t>
       </w:r>
     </w:p>
     <w:p>
@@ -68,7 +66,7 @@
             <w:sz w:val="22"/>
             <w:rFonts w:ascii="Calibri" w:hAnsi="Calibri"/>
           </w:rPr>
-          <w:t>scaemrfung.github.io/pe-playbook</w:t>
+          <w:t>SCA PE Playbook</w:t>
         </w:r>
       </w:hyperlink>
     </w:p>
@@ -78,7 +76,7 @@
           <w:rFonts w:ascii="Calibri" w:hAnsi="Calibri"/>
           <w:sz w:val="22"/>
         </w:rPr>
-        <w:t xml:space="preserve">House rules / how: </w:t>
+        <w:t xml:space="preserve">House rules: </w:t>
       </w:r>
       <w:hyperlink r:id="rId10">
         <w:r>
@@ -88,7 +86,7 @@
             <w:sz w:val="22"/>
             <w:rFonts w:ascii="Calibri" w:hAnsi="Calibri"/>
           </w:rPr>
-          <w:t>pe-playbook/how.html</w:t>
+          <w:t>How to use / house rules</w:t>
         </w:r>
       </w:hyperlink>
     </w:p>
@@ -108,7 +106,7 @@
             <w:sz w:val="22"/>
             <w:rFonts w:ascii="Calibri" w:hAnsi="Calibri"/>
           </w:rPr>
-          <w:t>pe-playbook/month.html?m=september</w:t>
+          <w:t>September month page</w:t>
         </w:r>
       </w:hyperlink>
     </w:p>
@@ -119,7 +117,7 @@
           <w:b w:val="0"/>
           <w:sz w:val="22"/>
         </w:rPr>
-        <w:t>Equipment: Footballs or foam footballs, beanbags, cones/hoops, pinnies</w:t>
+        <w:t>Equipment: Footballs or foam footballs, beanbags, cones/hoops, mats (end zones), pinnies</w:t>
       </w:r>
     </w:p>
     <w:p>
@@ -133,12 +131,10 @@
       </w:r>
     </w:p>
     <w:p>
+      <w:pPr>
+        <w:pStyle w:val="Heading2"/>
+      </w:pPr>
       <w:r>
-        <w:rPr>
-          <w:rFonts w:ascii="Calibri" w:hAnsi="Calibri"/>
-          <w:b/>
-          <w:sz w:val="22"/>
-        </w:rPr>
         <w:t>PEW (Alberta) — organizing ideas</w:t>
       </w:r>
     </w:p>
@@ -163,12 +159,10 @@
       </w:r>
     </w:p>
     <w:p>
+      <w:pPr>
+        <w:pStyle w:val="Heading2"/>
+      </w:pPr>
       <w:r>
-        <w:rPr>
-          <w:rFonts w:ascii="Calibri" w:hAnsi="Calibri"/>
-          <w:b/>
-          <w:sz w:val="22"/>
-        </w:rPr>
         <w:t>Shared look-fors this week</w:t>
       </w:r>
     </w:p>
@@ -223,12 +217,278 @@
       </w:r>
     </w:p>
     <w:p>
+      <w:pPr>
+        <w:pStyle w:val="Heading2"/>
+      </w:pPr>
+      <w:r>
+        <w:t>Game &amp; activity links used this week</w:t>
+      </w:r>
+    </w:p>
+    <w:p>
       <w:r>
         <w:rPr>
           <w:rFonts w:ascii="Calibri" w:hAnsi="Calibri"/>
-          <w:b/>
-          <w:sz w:val="24"/>
+          <w:b w:val="0"/>
+          <w:sz w:val="22"/>
         </w:rPr>
+        <w:t>Click any link for a demo or refresher:</w:t>
+      </w:r>
+    </w:p>
+    <w:p>
+      <w:r>
+        <w:rPr>
+          <w:rFonts w:ascii="Calibri" w:hAnsi="Calibri"/>
+          <w:sz w:val="22"/>
+        </w:rPr>
+        <w:t xml:space="preserve">Steal the Bacon: </w:t>
+      </w:r>
+      <w:hyperlink r:id="rId12">
+        <w:r>
+          <w:rPr>
+            <w:color w:val="0563C1"/>
+            <w:u w:val="single"/>
+            <w:sz w:val="22"/>
+            <w:rFonts w:ascii="Calibri" w:hAnsi="Calibri"/>
+          </w:rPr>
+          <w:t>PhysEdGames YouTube</w:t>
+        </w:r>
+      </w:hyperlink>
+    </w:p>
+    <w:p>
+      <w:r>
+        <w:rPr>
+          <w:rFonts w:ascii="Calibri" w:hAnsi="Calibri"/>
+          <w:sz w:val="22"/>
+        </w:rPr>
+        <w:t xml:space="preserve">Steal the Bacon rules: </w:t>
+      </w:r>
+      <w:hyperlink r:id="rId13">
+        <w:r>
+          <w:rPr>
+            <w:color w:val="0563C1"/>
+            <w:u w:val="single"/>
+            <w:sz w:val="22"/>
+            <w:rFonts w:ascii="Calibri" w:hAnsi="Calibri"/>
+          </w:rPr>
+          <w:t>physedgames.com/steal-the-bacon</w:t>
+        </w:r>
+      </w:hyperlink>
+    </w:p>
+    <w:p>
+      <w:r>
+        <w:rPr>
+          <w:rFonts w:ascii="Calibri" w:hAnsi="Calibri"/>
+          <w:sz w:val="22"/>
+        </w:rPr>
+        <w:t xml:space="preserve">Perfect Pass: </w:t>
+      </w:r>
+      <w:hyperlink r:id="rId14">
+        <w:r>
+          <w:rPr>
+            <w:color w:val="0563C1"/>
+            <w:u w:val="single"/>
+            <w:sz w:val="22"/>
+            <w:rFonts w:ascii="Calibri" w:hAnsi="Calibri"/>
+          </w:rPr>
+          <w:t>PhysEdGames rules</w:t>
+        </w:r>
+      </w:hyperlink>
+    </w:p>
+    <w:p>
+      <w:r>
+        <w:rPr>
+          <w:rFonts w:ascii="Calibri" w:hAnsi="Calibri"/>
+          <w:sz w:val="22"/>
+        </w:rPr>
+        <w:t xml:space="preserve">Perfect Pass demo: </w:t>
+      </w:r>
+      <w:hyperlink r:id="rId15">
+        <w:r>
+          <w:rPr>
+            <w:color w:val="0563C1"/>
+            <w:u w:val="single"/>
+            <w:sz w:val="22"/>
+            <w:rFonts w:ascii="Calibri" w:hAnsi="Calibri"/>
+          </w:rPr>
+          <w:t>YouTube — The Perfect Pass</w:t>
+        </w:r>
+      </w:hyperlink>
+    </w:p>
+    <w:p>
+      <w:r>
+        <w:rPr>
+          <w:rFonts w:ascii="Calibri" w:hAnsi="Calibri"/>
+          <w:sz w:val="22"/>
+        </w:rPr>
+        <w:t xml:space="preserve">Football Frenzy (lead-pass option): </w:t>
+      </w:r>
+      <w:hyperlink r:id="rId16">
+        <w:r>
+          <w:rPr>
+            <w:color w:val="0563C1"/>
+            <w:u w:val="single"/>
+            <w:sz w:val="22"/>
+            <w:rFonts w:ascii="Calibri" w:hAnsi="Calibri"/>
+          </w:rPr>
+          <w:t>PhysEdGames</w:t>
+        </w:r>
+      </w:hyperlink>
+    </w:p>
+    <w:p>
+      <w:r>
+        <w:rPr>
+          <w:rFonts w:ascii="Calibri" w:hAnsi="Calibri"/>
+          <w:sz w:val="22"/>
+        </w:rPr>
+        <w:t xml:space="preserve">End Zone: </w:t>
+      </w:r>
+      <w:hyperlink r:id="rId17">
+        <w:r>
+          <w:rPr>
+            <w:color w:val="0563C1"/>
+            <w:u w:val="single"/>
+            <w:sz w:val="22"/>
+            <w:rFonts w:ascii="Calibri" w:hAnsi="Calibri"/>
+          </w:rPr>
+          <w:t>Coach Gelardi short</w:t>
+        </w:r>
+      </w:hyperlink>
+    </w:p>
+    <w:p>
+      <w:r>
+        <w:rPr>
+          <w:rFonts w:ascii="Calibri" w:hAnsi="Calibri"/>
+          <w:sz w:val="22"/>
+        </w:rPr>
+        <w:t xml:space="preserve">Horse and Jockey (wu option): </w:t>
+      </w:r>
+      <w:hyperlink r:id="rId18">
+        <w:r>
+          <w:rPr>
+            <w:color w:val="0563C1"/>
+            <w:u w:val="single"/>
+            <w:sz w:val="22"/>
+            <w:rFonts w:ascii="Calibri" w:hAnsi="Calibri"/>
+          </w:rPr>
+          <w:t>Daly Exercise YouTube</w:t>
+        </w:r>
+      </w:hyperlink>
+    </w:p>
+    <w:p>
+      <w:r>
+        <w:rPr>
+          <w:rFonts w:ascii="Calibri" w:hAnsi="Calibri"/>
+          <w:sz w:val="22"/>
+        </w:rPr>
+        <w:t xml:space="preserve">Elementary Ultimate (apply-day shape): </w:t>
+      </w:r>
+      <w:hyperlink r:id="rId19">
+        <w:r>
+          <w:rPr>
+            <w:color w:val="0563C1"/>
+            <w:u w:val="single"/>
+            <w:sz w:val="22"/>
+            <w:rFonts w:ascii="Calibri" w:hAnsi="Calibri"/>
+          </w:rPr>
+          <w:t>Prime Coaching Sport</w:t>
+        </w:r>
+      </w:hyperlink>
+    </w:p>
+    <w:p>
+      <w:r>
+        <w:rPr>
+          <w:rFonts w:ascii="Calibri" w:hAnsi="Calibri"/>
+          <w:sz w:val="22"/>
+        </w:rPr>
+        <w:t xml:space="preserve">PhysEdGames channel: </w:t>
+      </w:r>
+      <w:hyperlink r:id="rId20">
+        <w:r>
+          <w:rPr>
+            <w:color w:val="0563C1"/>
+            <w:u w:val="single"/>
+            <w:sz w:val="22"/>
+            <w:rFonts w:ascii="Calibri" w:hAnsi="Calibri"/>
+          </w:rPr>
+          <w:t>@physedgames</w:t>
+        </w:r>
+      </w:hyperlink>
+    </w:p>
+    <w:p>
+      <w:r>
+        <w:rPr>
+          <w:rFonts w:ascii="Calibri" w:hAnsi="Calibri"/>
+          <w:sz w:val="22"/>
+        </w:rPr>
+        <w:t xml:space="preserve">Coach Gelardi: </w:t>
+      </w:r>
+      <w:hyperlink r:id="rId21">
+        <w:r>
+          <w:rPr>
+            <w:color w:val="0563C1"/>
+            <w:u w:val="single"/>
+            <w:sz w:val="22"/>
+            <w:rFonts w:ascii="Calibri" w:hAnsi="Calibri"/>
+          </w:rPr>
+          <w:t>@CoachGelardi</w:t>
+        </w:r>
+      </w:hyperlink>
+    </w:p>
+    <w:p>
+      <w:r>
+        <w:rPr>
+          <w:rFonts w:ascii="Calibri" w:hAnsi="Calibri"/>
+          <w:sz w:val="22"/>
+        </w:rPr>
+        <w:t xml:space="preserve">Daly Exercise: </w:t>
+      </w:r>
+      <w:hyperlink r:id="rId22">
+        <w:r>
+          <w:rPr>
+            <w:color w:val="0563C1"/>
+            <w:u w:val="single"/>
+            <w:sz w:val="22"/>
+            <w:rFonts w:ascii="Calibri" w:hAnsi="Calibri"/>
+          </w:rPr>
+          <w:t>@Daly-Exercise</w:t>
+        </w:r>
+      </w:hyperlink>
+    </w:p>
+    <w:p>
+      <w:r>
+        <w:rPr>
+          <w:rFonts w:ascii="Calibri" w:hAnsi="Calibri"/>
+          <w:sz w:val="22"/>
+        </w:rPr>
+        <w:t xml:space="preserve">Prime Coaching Sport: </w:t>
+      </w:r>
+      <w:hyperlink r:id="rId23">
+        <w:r>
+          <w:rPr>
+            <w:color w:val="0563C1"/>
+            <w:u w:val="single"/>
+            <w:sz w:val="22"/>
+            <w:rFonts w:ascii="Calibri" w:hAnsi="Calibri"/>
+          </w:rPr>
+          <w:t>@PrimeCoachingSport</w:t>
+        </w:r>
+      </w:hyperlink>
+    </w:p>
+    <w:p>
+      <w:r>
+        <w:rPr>
+          <w:rFonts w:ascii="Calibri" w:hAnsi="Calibri"/>
+          <w:b w:val="0"/>
+          <w:sz w:val="22"/>
+        </w:rPr>
+        <w:t>Mat Football (library): throw foam footballs into mat end zones — stay-in; no separate video link.</w:t>
+      </w:r>
+    </w:p>
+    <w:p>
+      <w:pPr>
+        <w:pStyle w:val="Heading2"/>
+      </w:pPr>
+      <w:r>
         <w:t>Grades 1–2</w:t>
       </w:r>
     </w:p>
@@ -236,7 +496,7 @@
       <w:r>
         <w:rPr>
           <w:rFonts w:ascii="Calibri" w:hAnsi="Calibri"/>
-          <w:b w:val="0"/>
+          <w:b/>
           <w:sz w:val="22"/>
         </w:rPr>
         <w:t>Focus: Beanbag hike, underhand catch, short throw, walk the route — foam OK</w:t>
@@ -347,7 +607,7 @@
           <w:b w:val="0"/>
           <w:sz w:val="22"/>
         </w:rPr>
-        <w:t>wu: Self-toss and catch.</w:t>
+        <w:t>wu: Self-toss and catch · or Horse and Jockey.</w:t>
       </w:r>
     </w:p>
     <w:p>
@@ -367,7 +627,7 @@
           <w:b w:val="0"/>
           <w:sz w:val="22"/>
         </w:rPr>
-        <w:t>game: Throw-clap-catch relay (underhand).</w:t>
+        <w:t>game: Perfect Pass — underhand to a teammate standing in a hoop (both feet in = collect hoop). Walk pace OK.</w:t>
       </w:r>
     </w:p>
     <w:p>
@@ -414,7 +674,25 @@
             <w:sz w:val="22"/>
             <w:rFonts w:ascii="Calibri" w:hAnsi="Calibri"/>
           </w:rPr>
-          <w:t>Horse and Jockey (wu option)</w:t>
+          <w:t>Perfect Pass</w:t>
+        </w:r>
+      </w:hyperlink>
+      <w:r>
+        <w:rPr>
+          <w:rFonts w:ascii="Calibri" w:hAnsi="Calibri"/>
+          <w:sz w:val="22"/>
+        </w:rPr>
+        <w:t xml:space="preserve"> · </w:t>
+      </w:r>
+      <w:hyperlink r:id="rId18">
+        <w:r>
+          <w:rPr>
+            <w:color w:val="0563C1"/>
+            <w:u w:val="single"/>
+            <w:sz w:val="22"/>
+            <w:rFonts w:ascii="Calibri" w:hAnsi="Calibri"/>
+          </w:rPr>
+          <w:t>Horse and Jockey</w:t>
         </w:r>
       </w:hyperlink>
     </w:p>
@@ -546,7 +824,7 @@
         </w:rPr>
         <w:t xml:space="preserve">Links: </w:t>
       </w:r>
-      <w:hyperlink r:id="rId15">
+      <w:hyperlink r:id="rId17">
         <w:r>
           <w:rPr>
             <w:color w:val="0563C1"/>
@@ -554,7 +832,25 @@
             <w:sz w:val="22"/>
             <w:rFonts w:ascii="Calibri" w:hAnsi="Calibri"/>
           </w:rPr>
-          <w:t>End Zone idea (Coach Gelardi short)</w:t>
+          <w:t>End Zone idea (Coach Gelardi)</w:t>
+        </w:r>
+      </w:hyperlink>
+      <w:r>
+        <w:rPr>
+          <w:rFonts w:ascii="Calibri" w:hAnsi="Calibri"/>
+          <w:sz w:val="22"/>
+        </w:rPr>
+        <w:t xml:space="preserve"> · </w:t>
+      </w:r>
+      <w:hyperlink r:id="rId19">
+        <w:r>
+          <w:rPr>
+            <w:color w:val="0563C1"/>
+            <w:u w:val="single"/>
+            <w:sz w:val="22"/>
+            <w:rFonts w:ascii="Calibri" w:hAnsi="Calibri"/>
+          </w:rPr>
+          <w:t>Elementary Ultimate shape</w:t>
         </w:r>
       </w:hyperlink>
       <w:r>
@@ -613,7 +909,7 @@
           <w:b w:val="0"/>
           <w:sz w:val="22"/>
         </w:rPr>
-        <w:t>game: Steal the Bacon or End Zone Ball / Ultimate-style beanbag (walk routes).</w:t>
+        <w:t>game: Mat Football (foam into mat end zones) or Steal the Bacon / Perfect Pass.</w:t>
       </w:r>
     </w:p>
     <w:p>
@@ -634,7 +930,7 @@
         </w:rPr>
         <w:t xml:space="preserve">Links: </w:t>
       </w:r>
-      <w:hyperlink r:id="rId12">
+      <w:hyperlink r:id="rId13">
         <w:r>
           <w:rPr>
             <w:color w:val="0563C1"/>
@@ -652,7 +948,7 @@
         </w:rPr>
         <w:t xml:space="preserve"> · </w:t>
       </w:r>
-      <w:hyperlink r:id="rId15">
+      <w:hyperlink r:id="rId14">
         <w:r>
           <w:rPr>
             <w:color w:val="0563C1"/>
@@ -660,7 +956,7 @@
             <w:sz w:val="22"/>
             <w:rFonts w:ascii="Calibri" w:hAnsi="Calibri"/>
           </w:rPr>
-          <w:t>End Zone</w:t>
+          <w:t>Perfect Pass</w:t>
         </w:r>
       </w:hyperlink>
       <w:r>
@@ -670,7 +966,7 @@
         </w:rPr>
         <w:t xml:space="preserve"> · </w:t>
       </w:r>
-      <w:hyperlink r:id="rId14">
+      <w:hyperlink r:id="rId18">
         <w:r>
           <w:rPr>
             <w:color w:val="0563C1"/>
@@ -693,12 +989,10 @@
       </w:r>
     </w:p>
     <w:p>
+      <w:pPr>
+        <w:pStyle w:val="Heading2"/>
+      </w:pPr>
       <w:r>
-        <w:rPr>
-          <w:rFonts w:ascii="Calibri" w:hAnsi="Calibri"/>
-          <w:b/>
-          <w:sz w:val="24"/>
-        </w:rPr>
         <w:t>Grades 3–4</w:t>
       </w:r>
     </w:p>
@@ -706,7 +1000,7 @@
       <w:r>
         <w:rPr>
           <w:rFonts w:ascii="Calibri" w:hAnsi="Calibri"/>
-          <w:b w:val="0"/>
+          <w:b/>
           <w:sz w:val="22"/>
         </w:rPr>
         <w:t>Focus: Football hike, soft spiral if it stays soft, step-back catch, jog the route</w:t>
@@ -817,7 +1111,7 @@
           <w:b w:val="0"/>
           <w:sz w:val="22"/>
         </w:rPr>
-        <w:t>wu: Self-toss and catch.</w:t>
+        <w:t>wu: Self-toss and catch · or Horse and Jockey.</w:t>
       </w:r>
     </w:p>
     <w:p>
@@ -837,7 +1131,7 @@
           <w:b w:val="0"/>
           <w:sz w:val="22"/>
         </w:rPr>
-        <w:t>game: Throw-clap-catch relay.</w:t>
+        <w:t>game: Perfect Pass — catcher in hoop; both feet in to collect. Soft spiral OK.</w:t>
       </w:r>
     </w:p>
     <w:p>
@@ -884,7 +1178,25 @@
             <w:sz w:val="22"/>
             <w:rFonts w:ascii="Calibri" w:hAnsi="Calibri"/>
           </w:rPr>
-          <w:t>Horse and Jockey (wu option)</w:t>
+          <w:t>Perfect Pass</w:t>
+        </w:r>
+      </w:hyperlink>
+      <w:r>
+        <w:rPr>
+          <w:rFonts w:ascii="Calibri" w:hAnsi="Calibri"/>
+          <w:sz w:val="22"/>
+        </w:rPr>
+        <w:t xml:space="preserve"> · </w:t>
+      </w:r>
+      <w:hyperlink r:id="rId18">
+        <w:r>
+          <w:rPr>
+            <w:color w:val="0563C1"/>
+            <w:u w:val="single"/>
+            <w:sz w:val="22"/>
+            <w:rFonts w:ascii="Calibri" w:hAnsi="Calibri"/>
+          </w:rPr>
+          <w:t>Horse and Jockey</w:t>
         </w:r>
       </w:hyperlink>
     </w:p>
@@ -995,7 +1307,7 @@
           <w:b w:val="0"/>
           <w:sz w:val="22"/>
         </w:rPr>
-        <w:t>game: Ultimate-style beanbag: three completes to score (jog).</w:t>
+        <w:t>game: Ultimate-style beanbag/football: three completes to score (jog). Optional Football Frenzy lead-pass square.</w:t>
       </w:r>
     </w:p>
     <w:p>
@@ -1016,7 +1328,7 @@
         </w:rPr>
         <w:t xml:space="preserve">Links: </w:t>
       </w:r>
-      <w:hyperlink r:id="rId15">
+      <w:hyperlink r:id="rId17">
         <w:r>
           <w:rPr>
             <w:color w:val="0563C1"/>
@@ -1025,6 +1337,24 @@
             <w:rFonts w:ascii="Calibri" w:hAnsi="Calibri"/>
           </w:rPr>
           <w:t>End Zone idea</w:t>
+        </w:r>
+      </w:hyperlink>
+      <w:r>
+        <w:rPr>
+          <w:rFonts w:ascii="Calibri" w:hAnsi="Calibri"/>
+          <w:sz w:val="22"/>
+        </w:rPr>
+        <w:t xml:space="preserve"> · </w:t>
+      </w:r>
+      <w:hyperlink r:id="rId16">
+        <w:r>
+          <w:rPr>
+            <w:color w:val="0563C1"/>
+            <w:u w:val="single"/>
+            <w:sz w:val="22"/>
+            <w:rFonts w:ascii="Calibri" w:hAnsi="Calibri"/>
+          </w:rPr>
+          <w:t>Football Frenzy</w:t>
         </w:r>
       </w:hyperlink>
       <w:r>
@@ -1083,7 +1413,7 @@
           <w:b w:val="0"/>
           <w:sz w:val="22"/>
         </w:rPr>
-        <w:t>game: Steal the Bacon or End Zone Ball / Ultimate-style beanbag.</w:t>
+        <w:t>game: Mat Football or Steal the Bacon / Perfect Pass / End Zone Ball.</w:t>
       </w:r>
     </w:p>
     <w:p>
@@ -1104,7 +1434,7 @@
         </w:rPr>
         <w:t xml:space="preserve">Links: </w:t>
       </w:r>
-      <w:hyperlink r:id="rId12">
+      <w:hyperlink r:id="rId13">
         <w:r>
           <w:rPr>
             <w:color w:val="0563C1"/>
@@ -1122,7 +1452,25 @@
         </w:rPr>
         <w:t xml:space="preserve"> · </w:t>
       </w:r>
-      <w:hyperlink r:id="rId15">
+      <w:hyperlink r:id="rId14">
+        <w:r>
+          <w:rPr>
+            <w:color w:val="0563C1"/>
+            <w:u w:val="single"/>
+            <w:sz w:val="22"/>
+            <w:rFonts w:ascii="Calibri" w:hAnsi="Calibri"/>
+          </w:rPr>
+          <w:t>Perfect Pass</w:t>
+        </w:r>
+      </w:hyperlink>
+      <w:r>
+        <w:rPr>
+          <w:rFonts w:ascii="Calibri" w:hAnsi="Calibri"/>
+          <w:sz w:val="22"/>
+        </w:rPr>
+        <w:t xml:space="preserve"> · </w:t>
+      </w:r>
+      <w:hyperlink r:id="rId17">
         <w:r>
           <w:rPr>
             <w:color w:val="0563C1"/>
@@ -1140,7 +1488,7 @@
         </w:rPr>
         <w:t xml:space="preserve"> · </w:t>
       </w:r>
-      <w:hyperlink r:id="rId14">
+      <w:hyperlink r:id="rId18">
         <w:r>
           <w:rPr>
             <w:color w:val="0563C1"/>
@@ -1163,12 +1511,10 @@
       </w:r>
     </w:p>
     <w:p>
+      <w:pPr>
+        <w:pStyle w:val="Heading2"/>
+      </w:pPr>
       <w:r>
-        <w:rPr>
-          <w:rFonts w:ascii="Calibri" w:hAnsi="Calibri"/>
-          <w:b/>
-          <w:sz w:val="24"/>
-        </w:rPr>
         <w:t>Grades 5–6</w:t>
       </w:r>
     </w:p>
@@ -1176,7 +1522,7 @@
       <w:r>
         <w:rPr>
           <w:rFonts w:ascii="Calibri" w:hAnsi="Calibri"/>
-          <w:b w:val="0"/>
+          <w:b/>
           <w:sz w:val="22"/>
         </w:rPr>
         <w:t>Focus: Hike on a clap, opposite-hand catch, lead the receiver, shadow defender, student leadership</w:t>
@@ -1287,7 +1633,7 @@
           <w:b w:val="0"/>
           <w:sz w:val="22"/>
         </w:rPr>
-        <w:t>wu: Self-toss and catch.</w:t>
+        <w:t>wu: Self-toss and catch · or Horse and Jockey.</w:t>
       </w:r>
     </w:p>
     <w:p>
@@ -1307,7 +1653,7 @@
           <w:b w:val="0"/>
           <w:sz w:val="22"/>
         </w:rPr>
-        <w:t>game: Throw-clap-catch relay; student starters.</w:t>
+        <w:t>game: Perfect Pass — catcher in hoop; soft spiral; student starters.</w:t>
       </w:r>
     </w:p>
     <w:p>
@@ -1354,7 +1700,43 @@
             <w:sz w:val="22"/>
             <w:rFonts w:ascii="Calibri" w:hAnsi="Calibri"/>
           </w:rPr>
-          <w:t>Horse and Jockey (wu option)</w:t>
+          <w:t>Perfect Pass</w:t>
+        </w:r>
+      </w:hyperlink>
+      <w:r>
+        <w:rPr>
+          <w:rFonts w:ascii="Calibri" w:hAnsi="Calibri"/>
+          <w:sz w:val="22"/>
+        </w:rPr>
+        <w:t xml:space="preserve"> · </w:t>
+      </w:r>
+      <w:hyperlink r:id="rId15">
+        <w:r>
+          <w:rPr>
+            <w:color w:val="0563C1"/>
+            <w:u w:val="single"/>
+            <w:sz w:val="22"/>
+            <w:rFonts w:ascii="Calibri" w:hAnsi="Calibri"/>
+          </w:rPr>
+          <w:t>Perfect Pass demo</w:t>
+        </w:r>
+      </w:hyperlink>
+      <w:r>
+        <w:rPr>
+          <w:rFonts w:ascii="Calibri" w:hAnsi="Calibri"/>
+          <w:sz w:val="22"/>
+        </w:rPr>
+        <w:t xml:space="preserve"> · </w:t>
+      </w:r>
+      <w:hyperlink r:id="rId18">
+        <w:r>
+          <w:rPr>
+            <w:color w:val="0563C1"/>
+            <w:u w:val="single"/>
+            <w:sz w:val="22"/>
+            <w:rFonts w:ascii="Calibri" w:hAnsi="Calibri"/>
+          </w:rPr>
+          <w:t>Horse and Jockey</w:t>
         </w:r>
       </w:hyperlink>
     </w:p>
@@ -1465,7 +1847,7 @@
           <w:b w:val="0"/>
           <w:sz w:val="22"/>
         </w:rPr>
-        <w:t>game: Ultimate-style beanbag: three completes to score. Student refs.</w:t>
+        <w:t>game: Ultimate-style: three completes to score. Or Football Frenzy lead-pass square. Student refs.</w:t>
       </w:r>
     </w:p>
     <w:p>
@@ -1486,7 +1868,7 @@
         </w:rPr>
         <w:t xml:space="preserve">Links: </w:t>
       </w:r>
-      <w:hyperlink r:id="rId15">
+      <w:hyperlink r:id="rId17">
         <w:r>
           <w:rPr>
             <w:color w:val="0563C1"/>
@@ -1495,6 +1877,42 @@
             <w:rFonts w:ascii="Calibri" w:hAnsi="Calibri"/>
           </w:rPr>
           <w:t>End Zone idea</w:t>
+        </w:r>
+      </w:hyperlink>
+      <w:r>
+        <w:rPr>
+          <w:rFonts w:ascii="Calibri" w:hAnsi="Calibri"/>
+          <w:sz w:val="22"/>
+        </w:rPr>
+        <w:t xml:space="preserve"> · </w:t>
+      </w:r>
+      <w:hyperlink r:id="rId16">
+        <w:r>
+          <w:rPr>
+            <w:color w:val="0563C1"/>
+            <w:u w:val="single"/>
+            <w:sz w:val="22"/>
+            <w:rFonts w:ascii="Calibri" w:hAnsi="Calibri"/>
+          </w:rPr>
+          <w:t>Football Frenzy</w:t>
+        </w:r>
+      </w:hyperlink>
+      <w:r>
+        <w:rPr>
+          <w:rFonts w:ascii="Calibri" w:hAnsi="Calibri"/>
+          <w:sz w:val="22"/>
+        </w:rPr>
+        <w:t xml:space="preserve"> · </w:t>
+      </w:r>
+      <w:hyperlink r:id="rId19">
+        <w:r>
+          <w:rPr>
+            <w:color w:val="0563C1"/>
+            <w:u w:val="single"/>
+            <w:sz w:val="22"/>
+            <w:rFonts w:ascii="Calibri" w:hAnsi="Calibri"/>
+          </w:rPr>
+          <w:t>Elementary Ultimate</w:t>
         </w:r>
       </w:hyperlink>
       <w:r>
@@ -1553,7 +1971,7 @@
           <w:b w:val="0"/>
           <w:sz w:val="22"/>
         </w:rPr>
-        <w:t>game: Steal the Bacon or End Zone Ball / Ultimate-style beanbag; 5–6 lead numbers, refs, or stations.</w:t>
+        <w:t>game: Mat Football or Steal the Bacon / Perfect Pass / End Zone Ball; 5–6 lead numbers, refs, or stations.</w:t>
       </w:r>
     </w:p>
     <w:p>
@@ -1574,7 +1992,7 @@
         </w:rPr>
         <w:t xml:space="preserve">Links: </w:t>
       </w:r>
-      <w:hyperlink r:id="rId12">
+      <w:hyperlink r:id="rId13">
         <w:r>
           <w:rPr>
             <w:color w:val="0563C1"/>
@@ -1592,7 +2010,25 @@
         </w:rPr>
         <w:t xml:space="preserve"> · </w:t>
       </w:r>
-      <w:hyperlink r:id="rId15">
+      <w:hyperlink r:id="rId14">
+        <w:r>
+          <w:rPr>
+            <w:color w:val="0563C1"/>
+            <w:u w:val="single"/>
+            <w:sz w:val="22"/>
+            <w:rFonts w:ascii="Calibri" w:hAnsi="Calibri"/>
+          </w:rPr>
+          <w:t>Perfect Pass</w:t>
+        </w:r>
+      </w:hyperlink>
+      <w:r>
+        <w:rPr>
+          <w:rFonts w:ascii="Calibri" w:hAnsi="Calibri"/>
+          <w:sz w:val="22"/>
+        </w:rPr>
+        <w:t xml:space="preserve"> · </w:t>
+      </w:r>
+      <w:hyperlink r:id="rId17">
         <w:r>
           <w:rPr>
             <w:color w:val="0563C1"/>
@@ -1610,7 +2046,7 @@
         </w:rPr>
         <w:t xml:space="preserve"> · </w:t>
       </w:r>
-      <w:hyperlink r:id="rId14">
+      <w:hyperlink r:id="rId18">
         <w:r>
           <w:rPr>
             <w:color w:val="0563C1"/>
@@ -1633,12 +2069,10 @@
       </w:r>
     </w:p>
     <w:p>
+      <w:pPr>
+        <w:pStyle w:val="Heading2"/>
+      </w:pPr>
       <w:r>
-        <w:rPr>
-          <w:rFonts w:ascii="Calibri" w:hAnsi="Calibri"/>
-          <w:b/>
-          <w:sz w:val="22"/>
-        </w:rPr>
         <w:t>If the gym is short</w:t>
       </w:r>
     </w:p>
@@ -1653,242 +2087,10 @@
       </w:r>
     </w:p>
     <w:p>
+      <w:pPr>
+        <w:pStyle w:val="Heading2"/>
+      </w:pPr>
       <w:r>
-        <w:rPr>
-          <w:rFonts w:ascii="Calibri" w:hAnsi="Calibri"/>
-          <w:b/>
-          <w:sz w:val="22"/>
-        </w:rPr>
-        <w:t>Game &amp; activity links</w:t>
-      </w:r>
-    </w:p>
-    <w:p>
-      <w:r>
-        <w:rPr>
-          <w:rFonts w:ascii="Calibri" w:hAnsi="Calibri"/>
-          <w:sz w:val="22"/>
-        </w:rPr>
-        <w:t xml:space="preserve">Playbook home: </w:t>
-      </w:r>
-      <w:hyperlink r:id="rId9">
-        <w:r>
-          <w:rPr>
-            <w:color w:val="0563C1"/>
-            <w:u w:val="single"/>
-            <w:sz w:val="22"/>
-            <w:rFonts w:ascii="Calibri" w:hAnsi="Calibri"/>
-          </w:rPr>
-          <w:t>scaemrfung.github.io/pe-playbook</w:t>
-        </w:r>
-      </w:hyperlink>
-    </w:p>
-    <w:p>
-      <w:r>
-        <w:rPr>
-          <w:rFonts w:ascii="Calibri" w:hAnsi="Calibri"/>
-          <w:sz w:val="22"/>
-        </w:rPr>
-        <w:t xml:space="preserve">How / house rules: </w:t>
-      </w:r>
-      <w:hyperlink r:id="rId10">
-        <w:r>
-          <w:rPr>
-            <w:color w:val="0563C1"/>
-            <w:u w:val="single"/>
-            <w:sz w:val="22"/>
-            <w:rFonts w:ascii="Calibri" w:hAnsi="Calibri"/>
-          </w:rPr>
-          <w:t>pe-playbook/how.html</w:t>
-        </w:r>
-      </w:hyperlink>
-    </w:p>
-    <w:p>
-      <w:r>
-        <w:rPr>
-          <w:rFonts w:ascii="Calibri" w:hAnsi="Calibri"/>
-          <w:sz w:val="22"/>
-        </w:rPr>
-        <w:t xml:space="preserve">September month (football context): </w:t>
-      </w:r>
-      <w:hyperlink r:id="rId11">
-        <w:r>
-          <w:rPr>
-            <w:color w:val="0563C1"/>
-            <w:u w:val="single"/>
-            <w:sz w:val="22"/>
-            <w:rFonts w:ascii="Calibri" w:hAnsi="Calibri"/>
-          </w:rPr>
-          <w:t>month.html?m=september</w:t>
-        </w:r>
-      </w:hyperlink>
-    </w:p>
-    <w:p>
-      <w:r>
-        <w:rPr>
-          <w:rFonts w:ascii="Calibri" w:hAnsi="Calibri"/>
-          <w:sz w:val="22"/>
-        </w:rPr>
-        <w:t xml:space="preserve">Steal the Bacon (PhysEdGames YouTube): </w:t>
-      </w:r>
-      <w:hyperlink r:id="rId12">
-        <w:r>
-          <w:rPr>
-            <w:color w:val="0563C1"/>
-            <w:u w:val="single"/>
-            <w:sz w:val="22"/>
-            <w:rFonts w:ascii="Calibri" w:hAnsi="Calibri"/>
-          </w:rPr>
-          <w:t>youtu.be/5U7vaay5Nmk</w:t>
-        </w:r>
-      </w:hyperlink>
-    </w:p>
-    <w:p>
-      <w:r>
-        <w:rPr>
-          <w:rFonts w:ascii="Calibri" w:hAnsi="Calibri"/>
-          <w:sz w:val="22"/>
-        </w:rPr>
-        <w:t xml:space="preserve">Steal the Bacon (PhysEdGames rules): </w:t>
-      </w:r>
-      <w:hyperlink r:id="rId13">
-        <w:r>
-          <w:rPr>
-            <w:color w:val="0563C1"/>
-            <w:u w:val="single"/>
-            <w:sz w:val="22"/>
-            <w:rFonts w:ascii="Calibri" w:hAnsi="Calibri"/>
-          </w:rPr>
-          <w:t>physedgames.com/steal-the-bacon</w:t>
-        </w:r>
-      </w:hyperlink>
-    </w:p>
-    <w:p>
-      <w:r>
-        <w:rPr>
-          <w:rFonts w:ascii="Calibri" w:hAnsi="Calibri"/>
-          <w:sz w:val="22"/>
-        </w:rPr>
-        <w:t xml:space="preserve">End Zone (Coach Gelardi short): </w:t>
-      </w:r>
-      <w:hyperlink r:id="rId15">
-        <w:r>
-          <w:rPr>
-            <w:color w:val="0563C1"/>
-            <w:u w:val="single"/>
-            <w:sz w:val="22"/>
-            <w:rFonts w:ascii="Calibri" w:hAnsi="Calibri"/>
-          </w:rPr>
-          <w:t>youtube.com/shorts/-z_JlLByzfA</w:t>
-        </w:r>
-      </w:hyperlink>
-    </w:p>
-    <w:p>
-      <w:r>
-        <w:rPr>
-          <w:rFonts w:ascii="Calibri" w:hAnsi="Calibri"/>
-          <w:sz w:val="22"/>
-        </w:rPr>
-        <w:t xml:space="preserve">Horse and Jockey (wu option): </w:t>
-      </w:r>
-      <w:hyperlink r:id="rId14">
-        <w:r>
-          <w:rPr>
-            <w:color w:val="0563C1"/>
-            <w:u w:val="single"/>
-            <w:sz w:val="22"/>
-            <w:rFonts w:ascii="Calibri" w:hAnsi="Calibri"/>
-          </w:rPr>
-          <w:t>youtu.be/Gn4Uai6dbpU</w:t>
-        </w:r>
-      </w:hyperlink>
-    </w:p>
-    <w:p>
-      <w:r>
-        <w:rPr>
-          <w:rFonts w:ascii="Calibri" w:hAnsi="Calibri"/>
-          <w:sz w:val="22"/>
-        </w:rPr>
-        <w:t xml:space="preserve">PhysEdGames channel: </w:t>
-      </w:r>
-      <w:hyperlink r:id="rId16">
-        <w:r>
-          <w:rPr>
-            <w:color w:val="0563C1"/>
-            <w:u w:val="single"/>
-            <w:sz w:val="22"/>
-            <w:rFonts w:ascii="Calibri" w:hAnsi="Calibri"/>
-          </w:rPr>
-          <w:t>youtube.com/@physedgames</w:t>
-        </w:r>
-      </w:hyperlink>
-    </w:p>
-    <w:p>
-      <w:r>
-        <w:rPr>
-          <w:rFonts w:ascii="Calibri" w:hAnsi="Calibri"/>
-          <w:sz w:val="22"/>
-        </w:rPr>
-        <w:t xml:space="preserve">Coach Gelardi: </w:t>
-      </w:r>
-      <w:hyperlink r:id="rId17">
-        <w:r>
-          <w:rPr>
-            <w:color w:val="0563C1"/>
-            <w:u w:val="single"/>
-            <w:sz w:val="22"/>
-            <w:rFonts w:ascii="Calibri" w:hAnsi="Calibri"/>
-          </w:rPr>
-          <w:t>youtube.com/@CoachGelardi</w:t>
-        </w:r>
-      </w:hyperlink>
-    </w:p>
-    <w:p>
-      <w:r>
-        <w:rPr>
-          <w:rFonts w:ascii="Calibri" w:hAnsi="Calibri"/>
-          <w:sz w:val="22"/>
-        </w:rPr>
-        <w:t xml:space="preserve">Daly Exercise: </w:t>
-      </w:r>
-      <w:hyperlink r:id="rId18">
-        <w:r>
-          <w:rPr>
-            <w:color w:val="0563C1"/>
-            <w:u w:val="single"/>
-            <w:sz w:val="22"/>
-            <w:rFonts w:ascii="Calibri" w:hAnsi="Calibri"/>
-          </w:rPr>
-          <w:t>youtube.com/@Daly-Exercise</w:t>
-        </w:r>
-      </w:hyperlink>
-    </w:p>
-    <w:p>
-      <w:r>
-        <w:rPr>
-          <w:rFonts w:ascii="Calibri" w:hAnsi="Calibri"/>
-          <w:sz w:val="22"/>
-        </w:rPr>
-        <w:t xml:space="preserve">Prime Coaching Sport: </w:t>
-      </w:r>
-      <w:hyperlink r:id="rId19">
-        <w:r>
-          <w:rPr>
-            <w:color w:val="0563C1"/>
-            <w:u w:val="single"/>
-            <w:sz w:val="22"/>
-            <w:rFonts w:ascii="Calibri" w:hAnsi="Calibri"/>
-          </w:rPr>
-          <w:t>youtube.com/@PrimeCoachingSport</w:t>
-        </w:r>
-      </w:hyperlink>
-    </w:p>
-    <w:p>
-      <w:r>
-        <w:rPr>
-          <w:rFonts w:ascii="Calibri" w:hAnsi="Calibri"/>
-          <w:b/>
-          <w:sz w:val="22"/>
-        </w:rPr>
         <w:t>Notes</w:t>
       </w:r>
     </w:p>
@@ -1919,12 +2121,22 @@
           <w:b w:val="0"/>
           <w:sz w:val="22"/>
         </w:rPr>
-        <w:t>Next calendar bump: Wed Sept 30 = National Day for Truth and Reconciliation (no school).</w:t>
+        <w:t>Library adds this handout: Perfect Pass, Mat Football, Football Frenzy (optional), Horse and Jockey (wu).</w:t>
+      </w:r>
+    </w:p>
+    <w:p>
+      <w:r>
+        <w:rPr>
+          <w:rFonts w:ascii="Calibri" w:hAnsi="Calibri"/>
+          <w:b w:val="0"/>
+          <w:sz w:val="22"/>
+        </w:rPr>
+        <w:t>Next calendar bump: Wed Sept 30 = National Day for Truth and Reconciliation (no school). Playbook Week 4 after that is buffer/festival (short week with Oct 2 PL).</w:t>
       </w:r>
     </w:p>
     <w:sectPr>
       <w:pgSz w:w="12240" w:h="15840"/>
-      <w:pgMar w:top="1440" w:right="1800" w:bottom="1440" w:left="1800" w:header="720" w:footer="720" w:gutter="0"/>
+      <w:pgMar w:top="1440" w:right="1620" w:bottom="1440" w:left="1620" w:header="720" w:footer="720" w:gutter="0"/>
       <w:cols w:space="720"/>
       <w:docGrid w:linePitch="360"/>
     </w:sectPr>
@@ -2295,6 +2507,10 @@
     <w:name w:val="Normal"/>
     <w:qFormat/>
     <w:rsid w:val="00FC693F"/>
+    <w:rPr>
+      <w:rFonts w:ascii="Calibri" w:hAnsi="Calibri"/>
+      <w:sz w:val="22"/>
+    </w:rPr>
   </w:style>
   <w:style w:type="paragraph" w:styleId="Header">
     <w:name w:val="header"/>

</xml_diff>